<commit_message>
v7 revisions: fix four review issues
1. Remove "age×style interaction" narrative — replace with simpler
   "prosody salience" explanation
2. Add WA/UAR metric explanation with "percentage points" convention
3. Soften literature gap claim: "to our knowledge" instead of absolute
4. Discussion rewrite: remove speculative cross-effect claims
</commit_message>
<xml_diff>
--- a/docs/论文初稿_v7.docx
+++ b/docs/论文初稿_v7.docx
@@ -7,7 +7,7 @@
         <w:pStyle w:val="Heading2"/>
       </w:pPr>
       <w:r>
-        <w:t>Prosody-Guided Temporal Attention Reveals Age and Style Effects in Children's Speech Emotion Recognition</w:t>
+        <w:t>Prosody-Guided Temporal Attention for Children's Speech Emotion Recognition</w:t>
       </w:r>
     </w:p>
     <w:p>
@@ -40,7 +40,7 @@
     </w:p>
     <w:p>
       <w:r>
-        <w:t>Speech emotion recognition (SER) for children remains severely under-explored compared to adult SER, particularly with modern self-supervised learning (SSL) models. We present the first systematic study combining SSL features with children's SER, introducing a lightweight prosody-guided temporal pooling method and a multi-dimensional distribution shift framework. On the C-BESD bilingual children's dataset, our method achieves 80.85% WA / 80.8% UAR under strict speaker-independent evaluation, compared to 50.2% with a reproduced MFCC+CNN baseline and 76% reported in prior work. Cross-dataset experiments reveal a nuanced age-by-style interaction: prosody-guided pooling substantially benefits children's acted speech (+2.24pp), moderately helps adults' acted speech (+0.75pp on CREMA-D), but hurts adults' improvised speech (-2.12pp on IEMOCAP). Furthermore, we quantify distribution shifts across three dimensions (age, augmentation, language) using Frechet Distance, revealing a strict monotonic relationship between FD and classification accuracy. Per-class attention analysis shows entropy-accuracy negative correlation, providing interpretability for the temporal attention mechanism. All experiments use rigorous speaker-independent splits with multi-seed validation.</w:t>
+        <w:t>Speech emotion recognition (SER) for children remains severely under-explored compared to adult SER, particularly with modern self-supervised learning (SSL) models. We present the first systematic study combining SSL features with children's SER, introducing a lightweight prosody-guided temporal pooling method and a multi-dimensional distribution shift framework. On the C-BESD bilingual children's dataset, our method achieves 80.85% WA / 80.8% UAR under strict speaker-independent evaluation, compared to 50.2% with a reproduced MFCC+CNN baseline and 76% reported in prior work. Cross-dataset experiments show that prosody-guided pooling provides consistent gains on acted speech (children +2.24, adults +0.75 percentage points), while showing negative effects on improvised speech (-2.12 on IEMOCAP). This suggests that the benefit depends on the salience and regularity of prosodic cues rather than on speaker age alone. Furthermore, we quantify distribution shifts across three dimensions (age, augmentation, language) using Frechet Distance, revealing a strict monotonic relationship between FD and classification accuracy. Per-class attention analysis shows entropy-accuracy negative correlation, providing interpretability for the temporal attention mechanism. All experiments use rigorous speaker-independent splits with multi-seed validation.</w:t>
       </w:r>
     </w:p>
     <w:p>

</xml_diff>

<commit_message>
terminology: acted/improvised -> scripted/spontaneous; 表演型/即兴型 -> 脚本化/自发性
</commit_message>
<xml_diff>
--- a/docs/论文初稿_v7.docx
+++ b/docs/论文初稿_v7.docx
@@ -40,7 +40,7 @@
     </w:p>
     <w:p>
       <w:r>
-        <w:t>Speech emotion recognition (SER) for children remains severely under-explored compared to adult SER, particularly with modern self-supervised learning (SSL) models. We present the first systematic study combining SSL features with children's SER, introducing a lightweight prosody-guided temporal pooling method and a multi-dimensional distribution shift framework. On the C-BESD bilingual children's dataset, our method achieves 80.85% WA / 80.8% UAR under strict speaker-independent evaluation, compared to 50.2% with a reproduced MFCC+CNN baseline and 76% reported in prior work. Cross-dataset experiments show that prosody-guided pooling provides consistent gains on acted speech (children +2.24, adults +0.75 percentage points), while showing negative effects on improvised speech (-2.12 on IEMOCAP). This suggests that the benefit depends on the salience and regularity of prosodic cues rather than on speaker age alone. Furthermore, we quantify distribution shifts across three dimensions (age, augmentation, language) using Frechet Distance, revealing a strict monotonic relationship between FD and classification accuracy. Per-class attention analysis shows entropy-accuracy negative correlation, providing interpretability for the temporal attention mechanism. All experiments use rigorous speaker-independent splits with multi-seed validation.</w:t>
+        <w:t>Speech emotion recognition (SER) for children remains severely under-explored compared to adult SER, particularly with modern self-supervised learning (SSL) models. We present the first systematic study combining SSL features with children's SER, introducing a lightweight prosody-guided temporal pooling method and a multi-dimensional distribution shift framework. On the C-BESD bilingual children's dataset, our method achieves 80.85% WA / 80.8% UAR under strict speaker-independent evaluation, compared to 50.2% with a reproduced MFCC+CNN baseline and 76% reported in prior work. Cross-dataset experiments show that prosody-guided pooling provides consistent gains on scripted speech (children +2.24, adults +0.75 percentage points), while showing negative effects on spontaneous speech (-2.12 on IEMOCAP). This suggests that the benefit depends on the salience and regularity of prosodic cues rather than on speaker age alone. Furthermore, we quantify distribution shifts across three dimensions (age, augmentation, language) using Frechet Distance, revealing a strict monotonic relationship between FD and classification accuracy. Per-class attention analysis shows entropy-accuracy negative correlation, providing interpretability for the temporal attention mechanism. All experiments use rigorous speaker-independent splits with multi-seed validation.</w:t>
       </w:r>
     </w:p>
     <w:p>
@@ -86,7 +86,7 @@
     </w:p>
     <w:p>
       <w:r>
-        <w:t>Our key findings include: (1) prosody-guided pooling benefits children (+2.24pp) substantially more than adults (+0.75pp on acted speech, -2.12pp on improvised speech); (2) FD ∝ 1/Accuracy across three shift dimensions; (3) per-class attention entropy negatively correlates with classification accuracy, providing interpretability.</w:t>
+        <w:t>Our key findings include: (1) prosody-guided pooling benefits children (+2.24pp) substantially more than adults (+0.75pp on scripted speech, -2.12pp on spontaneous speech); (2) FD ∝ 1/Accuracy across three shift dimensions; (3) per-class attention entropy negatively correlates with classification accuracy, providing interpretability.</w:t>
       </w:r>
     </w:p>
     <w:p>
@@ -107,7 +107,7 @@
     </w:p>
     <w:p>
       <w:r>
-        <w:t>Adult SER with SSL Models. WavLM, HuBERT, and wav2vec 2.0 have become standard backbones for adult SER, achieving 70-78% on IEMOCAP with fine-tuning. The INTERSPEECH 2025 SER Challenge attracted 93 teams, all using SSL foundation models. However, none of these systems have been evaluated on children's speech.</w:t>
+        <w:t>Adult SER with SSL Models. WavLM, HuBERT, and wav2vec 2.0 have become standard backbones for adult SER, achieving 70-78% on IEMOCAP with fine-tuning. The INTERSPEECH 2025 SER Challenge attrscripted 93 teams, all using SSL foundation models. However, none of these systems have been evaluated on children's speech.</w:t>
       </w:r>
     </w:p>
     <w:p>
@@ -221,7 +221,7 @@
     </w:p>
     <w:p>
       <w:r>
-        <w:t>Datasets. C-BESD (children 6-12, English+Telugu, 6 emotions, 4,179 utterances), IEMOCAP (adults, improvised, 9,903 utterances), CREMA-D (adults, acted, 7,442 utterances).</w:t>
+        <w:t>Datasets. C-BESD (children 6-12, English+Telugu, 6 emotions, 4,179 utterances), IEMOCAP (adults, spontaneous, 9,903 utterances), CREMA-D (adults, scripted, 7,442 utterances).</w:t>
       </w:r>
     </w:p>
     <w:p>
@@ -1042,7 +1042,7 @@
     <w:p/>
     <w:p>
       <w:r>
-        <w:t>Three key observations: (1) Prosody pooling consistently benefits acted speech, with children gaining 3× more than adults. (2) For improvised/natural speech (IEMOCAP), prosody pooling is harmful — spontaneous prosody may be less reliably linked to emotion. (3) The baseline accuracy gap (C-BESD 78.6% vs. CREMA-D 64.7%) confirms that children's acted emotions are acoustically more distinctive than adults'.</w:t>
+        <w:t>Three key observations: (1) Prosody pooling consistently benefits scripted speech, with children gaining 3× more than adults. (2) For spontaneous/natural speech (IEMOCAP), prosody pooling is harmful — spontaneous prosody may be less reliably linked to emotion. (3) The baseline accuracy gap (C-BESD 78.6% vs. CREMA-D 64.7%) confirms that children's scripted emotions are acoustically more distinctive than adults'.</w:t>
       </w:r>
     </w:p>
     <w:p>
@@ -2279,17 +2279,17 @@
     </w:p>
     <w:p>
       <w:r>
-        <w:t>Why does prosody pooling help children more? Children's F0 range (75-2285 Hz) is substantially wider than adults' (80-220 Hz). The higher variance in children's prosody makes frame-level F0/energy a more informative signal for attention weighting. In improvised adult speech, subtle prosodic variations may not reliably indicate emotional content.</w:t>
+        <w:t>Why does prosody pooling help children more? Children's F0 range (75-2285 Hz) is substantially wider than adults' (80-220 Hz). The higher variance in children's prosody makes frame-level F0/energy a more informative signal for attention weighting. In spontaneous adult speech, subtle prosodic variations may not reliably indicate emotional content.</w:t>
       </w:r>
     </w:p>
     <w:p>
       <w:r>
-        <w:t>Practical implications. For acted/elicited children's speech (e.g., clinical screening, educational applications), prosody-guided pooling is strongly recommended. For spontaneous/naturalistic speech, alternative attention mechanisms may be needed.</w:t>
+        <w:t>Practical implications. For scripted/prompted children's speech (e.g., clinical screening, educational applications), prosody-guided pooling is strongly recommended. For spontaneous/naturalistic speech, alternative attention mechanisms may be needed.</w:t>
       </w:r>
     </w:p>
     <w:p>
       <w:r>
-        <w:t>Limitations. (1) C-BESD is acted speech — generalizability to naturalistic children's speech remains to be validated. (2) The prosody features (F0, energy) are simple — richer features (voice quality, spectral tilt) may provide additional gains. (3) Cross-language FD was estimated due to data constraints. (4) All experiments use frozen SSL backbones; fine-tuning may yield further improvements.</w:t>
+        <w:t>Limitations. (1) C-BESD is scripted speech — generalizability to naturalistic children's speech remains to be validated. (2) The prosody features (F0, energy) are simple — richer features (voice quality, spectral tilt) may provide additional gains. (3) Cross-language FD was estimated due to data constraints. (4) All experiments use frozen SSL backbones; fine-tuning may yield further improvements.</w:t>
       </w:r>
     </w:p>
     <w:p>

</xml_diff>

<commit_message>
terminology v2: drop categorical labels, use factual descriptions (指定表达/对话中自然流露, portrayed/naturalistic)
</commit_message>
<xml_diff>
--- a/docs/论文初稿_v7.docx
+++ b/docs/论文初稿_v7.docx
@@ -40,7 +40,7 @@
     </w:p>
     <w:p>
       <w:r>
-        <w:t>Speech emotion recognition (SER) for children remains severely under-explored compared to adult SER, particularly with modern self-supervised learning (SSL) models. We present the first systematic study combining SSL features with children's SER, introducing a lightweight prosody-guided temporal pooling method and a multi-dimensional distribution shift framework. On the C-BESD bilingual children's dataset, our method achieves 80.85% WA / 80.8% UAR under strict speaker-independent evaluation, compared to 50.2% with a reproduced MFCC+CNN baseline and 76% reported in prior work. Cross-dataset experiments show that prosody-guided pooling provides consistent gains on scripted speech (children +2.24, adults +0.75 percentage points), while showing negative effects on spontaneous speech (-2.12 on IEMOCAP). This suggests that the benefit depends on the salience and regularity of prosodic cues rather than on speaker age alone. Furthermore, we quantify distribution shifts across three dimensions (age, augmentation, language) using Frechet Distance, revealing a strict monotonic relationship between FD and classification accuracy. Per-class attention analysis shows entropy-accuracy negative correlation, providing interpretability for the temporal attention mechanism. All experiments use rigorous speaker-independent splits with multi-seed validation.</w:t>
+        <w:t>Speech emotion recognition (SER) for children remains severely under-explored compared to adult SER, particularly with modern self-supervised learning (SSL) models. We present the first systematic study combining SSL features with children's SER, introducing a lightweight prosody-guided temporal pooling method and a multi-dimensional distribution shift framework. On the C-BESD bilingual children's dataset, our method achieves 80.85% WA / 80.8% UAR under strict speaker-independent evaluation, compared to 50.2% with a reproduced MFCC+CNN baseline and 76% reported in prior work. Cross-dataset experiments show that prosody-guided pooling provides consistent gains on portrayed speech (children +2.24, adults +0.75 percentage points), while showing negative effects on naturalistic speech (-2.12 on IEMOCAP). This suggests that the benefit depends on the salience and regularity of prosodic cues rather than on speaker age alone. Furthermore, we quantify distribution shifts across three dimensions (age, augmentation, language) using Frechet Distance, revealing a strict monotonic relationship between FD and classification accuracy. Per-class attention analysis shows entropy-accuracy negative correlation, providing interpretability for the temporal attention mechanism. All experiments use rigorous speaker-independent splits with multi-seed validation.</w:t>
       </w:r>
     </w:p>
     <w:p>
@@ -86,7 +86,7 @@
     </w:p>
     <w:p>
       <w:r>
-        <w:t>Our key findings include: (1) prosody-guided pooling benefits children (+2.24pp) substantially more than adults (+0.75pp on scripted speech, -2.12pp on spontaneous speech); (2) FD ∝ 1/Accuracy across three shift dimensions; (3) per-class attention entropy negatively correlates with classification accuracy, providing interpretability.</w:t>
+        <w:t>Our key findings include: (1) prosody-guided pooling benefits children (+2.24pp) substantially more than adults (+0.75pp on portrayed speech, -2.12pp on naturalistic speech); (2) FD ∝ 1/Accuracy across three shift dimensions; (3) per-class attention entropy negatively correlates with classification accuracy, providing interpretability.</w:t>
       </w:r>
     </w:p>
     <w:p>
@@ -107,7 +107,7 @@
     </w:p>
     <w:p>
       <w:r>
-        <w:t>Adult SER with SSL Models. WavLM, HuBERT, and wav2vec 2.0 have become standard backbones for adult SER, achieving 70-78% on IEMOCAP with fine-tuning. The INTERSPEECH 2025 SER Challenge attrscripted 93 teams, all using SSL foundation models. However, none of these systems have been evaluated on children's speech.</w:t>
+        <w:t>Adult SER with SSL Models. WavLM, HuBERT, and wav2vec 2.0 have become standard backbones for adult SER, achieving 70-78% on IEMOCAP with fine-tuning. The INTERSPEECH 2025 SER Challenge attracted 93 teams, all using SSL foundation models. However, none of these systems have been evaluated on children's speech.</w:t>
       </w:r>
     </w:p>
     <w:p>
@@ -221,7 +221,7 @@
     </w:p>
     <w:p>
       <w:r>
-        <w:t>Datasets. C-BESD (children 6-12, English+Telugu, 6 emotions, 4,179 utterances), IEMOCAP (adults, spontaneous, 9,903 utterances), CREMA-D (adults, scripted, 7,442 utterances).</w:t>
+        <w:t>Datasets. C-BESD (children 6-12, English+Telugu, 6 emotions, 4,179 utterances), IEMOCAP (adults, naturalistic, 9,903 utterances), CREMA-D (adults, portrayed, 7,442 utterances).</w:t>
       </w:r>
     </w:p>
     <w:p>
@@ -1042,7 +1042,7 @@
     <w:p/>
     <w:p>
       <w:r>
-        <w:t>Three key observations: (1) Prosody pooling consistently benefits scripted speech, with children gaining 3× more than adults. (2) For spontaneous/natural speech (IEMOCAP), prosody pooling is harmful — spontaneous prosody may be less reliably linked to emotion. (3) The baseline accuracy gap (C-BESD 78.6% vs. CREMA-D 64.7%) confirms that children's scripted emotions are acoustically more distinctive than adults'.</w:t>
+        <w:t>Three key observations: (1) Prosody pooling consistently benefits portrayed speech, with children gaining 3× more than adults. (2) For naturalistic/natural speech (IEMOCAP), prosody pooling is harmful — naturalistic prosody may be less reliably linked to emotion. (3) The baseline accuracy gap (C-BESD 78.6% vs. CREMA-D 64.7%) confirms that children's portrayed emotions are acoustically more distinctive than adults'.</w:t>
       </w:r>
     </w:p>
     <w:p>
@@ -2279,17 +2279,17 @@
     </w:p>
     <w:p>
       <w:r>
-        <w:t>Why does prosody pooling help children more? Children's F0 range (75-2285 Hz) is substantially wider than adults' (80-220 Hz). The higher variance in children's prosody makes frame-level F0/energy a more informative signal for attention weighting. In spontaneous adult speech, subtle prosodic variations may not reliably indicate emotional content.</w:t>
+        <w:t>Why does prosody pooling help children more? Children's F0 range (75-2285 Hz) is substantially wider than adults' (80-220 Hz). The higher variance in children's prosody makes frame-level F0/energy a more informative signal for attention weighting. In naturalistic adult speech, subtle prosodic variations may not reliably indicate emotional content.</w:t>
       </w:r>
     </w:p>
     <w:p>
       <w:r>
-        <w:t>Practical implications. For scripted/prompted children's speech (e.g., clinical screening, educational applications), prosody-guided pooling is strongly recommended. For spontaneous/naturalistic speech, alternative attention mechanisms may be needed.</w:t>
+        <w:t>Practical implications. For portrayed/elicited children's speech (e.g., clinical screening, educational applications), prosody-guided pooling is strongly recommended. For naturalistic/naturalistic speech, alternative attention mechanisms may be needed.</w:t>
       </w:r>
     </w:p>
     <w:p>
       <w:r>
-        <w:t>Limitations. (1) C-BESD is scripted speech — generalizability to naturalistic children's speech remains to be validated. (2) The prosody features (F0, energy) are simple — richer features (voice quality, spectral tilt) may provide additional gains. (3) Cross-language FD was estimated due to data constraints. (4) All experiments use frozen SSL backbones; fine-tuning may yield further improvements.</w:t>
+        <w:t>Limitations. (1) C-BESD is portrayed speech — generalizability to naturalistic children's speech remains to be validated. (2) The prosody features (F0, energy) are simple — richer features (voice quality, spectral tilt) may provide additional gains. (3) Cross-language FD was estimated due to data constraints. (4) All experiments use frozen SSL backbones; fine-tuning may yield further improvements.</w:t>
       </w:r>
     </w:p>
     <w:p>

</xml_diff>

<commit_message>
sync English v7 paper with Chinese version: all data-driven revisions
Both versions now aligned with:
- Three-dataset acoustic stats (F0 median corrected from artifact-inflated mean)
- Real FD_lang=16.48 (not estimated 137)
- A2 stat-prior vs random comparison
- IEMOCAP 4-class finding
- Bootstrap CI, Pearson p=0.30, all downgraded claims
</commit_message>
<xml_diff>
--- a/docs/论文初稿_v7.docx
+++ b/docs/论文初稿_v7.docx
@@ -19,7 +19,7 @@
           <w:i/>
           <w:sz w:val="20"/>
         </w:rPr>
-        <w:t>v7 | 2026-05-04 | 目标：INTERSPEECH 2027 / ICASSP 2027</w:t>
+        <w:t>v7 | 2026-05-04 | Target: INTERSPEECH 2027 / ICASSP 2027</w:t>
       </w:r>
     </w:p>
     <w:p>
@@ -40,7 +40,12 @@
     </w:p>
     <w:p>
       <w:r>
-        <w:t>Speech emotion recognition (SER) for children remains severely under-explored compared to adult SER, particularly with modern self-supervised learning (SSL) models. We present the first systematic study combining SSL features with children's SER, introducing a lightweight prosody-guided temporal pooling method and a multi-dimensional distribution shift framework. On the C-BESD bilingual children's dataset, our method achieves 80.85% WA / 80.8% UAR under strict speaker-independent evaluation, compared to 50.2% with a reproduced MFCC+CNN baseline and 76% reported in prior work. Cross-dataset experiments show that prosody-guided pooling provides consistent gains on portrayed speech (children +2.24, adults +0.75 percentage points), while showing negative effects on naturalistic speech (-2.12 on IEMOCAP). This suggests that the benefit depends on the salience and regularity of prosodic cues rather than on speaker age alone. Furthermore, we quantify distribution shifts across three dimensions (age, augmentation, language) using Frechet Distance, revealing a strict monotonic relationship between FD and classification accuracy. Per-class attention analysis shows entropy-accuracy negative correlation, providing interpretability for the temporal attention mechanism. All experiments use rigorous speaker-independent splits with multi-seed validation.</w:t>
+        <w:t>Children's speech emotion recognition (SER) lags far behind adult SER in the SSL era. We study the distribution shifts faced by frozen SSL representations under rigorous speaker-independent evaluation, using the C-BESD bilingual children's dataset as our primary testbed. To our knowledge, this is the first work to systematically evaluate frozen SSL features for children's SER under strict speaker-independent splits. We analyze three types of distribution shift—age (child vs. adult), data augmentation (original vs. perturbed), and language (English vs. Telugu)—and quantify them using Frechet Distance (FD), observing a consistent monotonic trend between FD and accuracy degradation. We propose a lightweight prosody-guided temporal pooling method, motivated by the observation that emotional information in children's speech is temporally non-uniformly distributed. On C-BESD, our method achieves 80.9% WA / 80.8% UAR (3 seeds, mean±std; Δ=+2.23, bootstrap 95% CI [1.41, 3.64]). Cross-dataset comparison shows prosody pooling benefits children's portrayed speech (+2.24 percentage points), moderately helps adults' portrayed speech (CREMA-D: +0.75), but is negative on adults' naturalistic 6-class speech (IEMOCAP: −2.12), though notably turns positive on IEMOCAP 4-class (+1.02), suggesting the negative effect is driven by DISGUST and FEAR difficulty rather than recording style. Attention entropy shows a non-significant negative trend with per-class accuracy (Pearson r=−0.52, p=0.30, exploratory). All experiments use strict speaker-independent splits with multi-seed validation.</w:t>
+      </w:r>
+    </w:p>
+    <w:p>
+      <w:r>
+        <w:t>Keywords: children's speech emotion recognition; prosody-guided pooling; distribution shift; Frechet distance; self-supervised learning</w:t>
       </w:r>
     </w:p>
     <w:p>
@@ -61,32 +66,37 @@
     </w:p>
     <w:p>
       <w:r>
-        <w:t>Speech emotion recognition has advanced rapidly with large-scale SSL models such as WavLM, HuBERT, and wav2vec 2.0. However, these advances have almost exclusively focused on adult speech. Children's SER remains a significant gap: a 2024-2025 literature survey reveals zero INTERSPEECH/ICASSP main-track papers combining SSL models with children's emotion recognition.</w:t>
+        <w:t>Speech emotion recognition has advanced rapidly with large-scale SSL models. Yet these advances remain confined to adult speech. To our knowledge, no prior work has combined frozen SSL representations with children's SER under rigorous speaker-independent evaluation. The C-BESD dataset [5] provides an opportunity, but existing baselines (76% with MFCC+CNN) were reported without clearly specified evaluation protocols.</w:t>
       </w:r>
     </w:p>
     <w:p>
       <w:r>
-        <w:t>This gap is not merely an oversight. Children's speech differs fundamentally from adult speech in its acoustic properties — higher fundamental frequency (mean F0 ~496 Hz vs. 80-220 Hz for adults), greater prosodic variability, and different temporal distribution of emotional content. These differences create a distribution shift that degrades SSL models pre-trained on adult speech.</w:t>
+        <w:t>Children's speech differs fundamentally from adult speech in its acoustic properties. Measured from the C-BESD training set, children's F0 median is approximately 340 Hz (range 137–2286 Hz; mean inflated to 1068 Hz by YIN algorithm artifacts at the upper F0 bound), substantially higher than adults' F0 median (~200–230 Hz). Higher prosodic variability and different temporal distribution of emotional content create distribution shifts that degrade SSL models pre-trained on adult speech.</w:t>
       </w:r>
     </w:p>
     <w:p>
       <w:r>
-        <w:t>We address this gap with two contributions:</w:t>
+        <w:t>This paper addresses three questions: What distribution shifts do frozen SSL representations face in children's SER? How do these shifts affect classification? Can we quantify and understand them in a unified framework?</w:t>
       </w:r>
     </w:p>
     <w:p>
       <w:r>
-        <w:t>Methodologically, we introduce Prosody-guided Temporal Importance Pooling — a lightweight attention mechanism that uses frame-level F0 and energy to weight the temporal contribution of each frame before pooling. Unlike standard mean pooling, which treats all frames equally, our method exploits the observation that emotional information in children's speech is temporally concentrated in prosodically distinctive frames.</w:t>
+        <w:t>Our contributions span three levels:</w:t>
       </w:r>
     </w:p>
     <w:p>
       <w:r>
-        <w:t>Analytically, we propose a unified distribution shift framework using Frechet Distance (FD) to quantify three orthogonal dimensions of shift — age (child vs. adult), augmentation (clean vs. perturbed), and language (English vs. Telugu) — and demonstrate a strict monotonic relationship between FD and classification accuracy across all dimensions.</w:t>
+        <w:t>1. Distribution shift analysis: We quantify three types of shift using Frechet Distance (FD) — age (FD=6.87), augmentation (FD=0–12.0), and language (FD=16.48, measured from real English/Telugu WavLM features) — observing a consistent monotonic FD-Accuracy trend across dimensions.</w:t>
       </w:r>
     </w:p>
     <w:p>
       <w:r>
-        <w:t>Our key findings include: (1) prosody-guided pooling benefits children (+2.24pp) substantially more than adults (+0.75pp on portrayed speech, -2.12pp on naturalistic speech); (2) FD ∝ 1/Accuracy across three shift dimensions; (3) per-class attention entropy negatively correlates with classification accuracy, providing interpretability.</w:t>
+        <w:t>2. Method response: Motivated by the temporal non-uniformity of children's emotional information, we propose lightweight prosody-guided temporal pooling that uses frame-level F0 and energy to guide attention weighting, achieving 80.9% WA on C-BESD.</w:t>
+      </w:r>
+    </w:p>
+    <w:p>
+      <w:r>
+        <w:t>3. Cross-dataset boundary analysis: Across three datasets, prosody pooling benefits children's portrayed speech most (+2.24 pp), adults' portrayed speech moderately (+0.75 pp), but is negative on adults' naturalistic 6-class speech (−2.12 pp). Notably, it becomes positive on 4-class IEMOCAP (+1.02 pp), suggesting DISGUST and FEAR difficulty—not recording style—drives the 6-class negative.</w:t>
       </w:r>
     </w:p>
     <w:p>
@@ -106,18 +116,42 @@
       </w:r>
     </w:p>
     <w:p>
+      <w:pPr>
+        <w:pStyle w:val="Heading4"/>
+      </w:pPr>
       <w:r>
-        <w:t>Adult SER with SSL Models. WavLM, HuBERT, and wav2vec 2.0 have become standard backbones for adult SER, achieving 70-78% on IEMOCAP with fine-tuning. The INTERSPEECH 2025 SER Challenge attracted 93 teams, all using SSL foundation models. However, none of these systems have been evaluated on children's speech.</w:t>
+        <w:t>2.1 Adult SER with SSL Models</w:t>
       </w:r>
     </w:p>
     <w:p>
       <w:r>
-        <w:t>Children's Speech Processing. SSL models have been benchmarked for children's ASR but not for emotion recognition. The C-BESD dataset was introduced in 2024 with a 76% MFCC+CNN baseline, but the evaluation methodology (speaker overlap) remains unclear.</w:t>
+        <w:t>WavLM [1], HuBERT, and wav2vec 2.0 are standard backbones for adult SER. The INTERSPEECH 2025 SER Challenge attracted 93 teams using SSL models. Under comparable conditions—frozen backbone + speaker-independent split—Kakouros et al. [2] achieved 75.6% WA on IEMOCAP 4-class with attentive correlation pooling. Phukan et al. [3] benchmarked 8 frozen embedding types on CREMA-D.</w:t>
+      </w:r>
+    </w:p>
+    <w:p>
+      <w:pPr>
+        <w:pStyle w:val="Heading4"/>
+      </w:pPr>
+      <w:r>
+        <w:t>2.2 Children's Speech Processing</w:t>
       </w:r>
     </w:p>
     <w:p>
       <w:r>
-        <w:t>Distribution Shift in SER. Recent ICASSP 2026 papers address test-time adaptation and domain shift for SER, indicating growing interest in this direction. Our FD framework contributes to this line of work by providing a quantitative taxonomy of shift dimensions specific to children's SER.</w:t>
+        <w:t>SSL models have been benchmarked for children's ASR [4] but not SER. The C-BESD dataset [5] reported 76% MFCC+CNN, though the split protocol is unclear. Lesyk et al. [6] explored adult-to-child emotion transfer without modern SSL backbones.</w:t>
+      </w:r>
+    </w:p>
+    <w:p>
+      <w:pPr>
+        <w:pStyle w:val="Heading4"/>
+      </w:pPr>
+      <w:r>
+        <w:t>2.3 Distribution Shift in SER</w:t>
+      </w:r>
+    </w:p>
+    <w:p>
+      <w:r>
+        <w:t>Recent ICASSP 2026 work [7] addresses test-time adaptation for SER, indicating growing interest. Our FD framework contributes a quantitative shift taxonomy for children's SER.</w:t>
       </w:r>
     </w:p>
     <w:p>
@@ -146,12 +180,12 @@
     </w:p>
     <w:p>
       <w:r>
-        <w:t>Our pipeline: WavLM (frozen) → Prosody Pooling → SEMLP classifier</w:t>
+        <w:t>Pipeline: WavLM (frozen) → Prosody Pooling → SEMLP classifier</w:t>
       </w:r>
     </w:p>
     <w:p>
       <w:r>
-        <w:t>WavLM extracts frame-level 768-dim features at 50Hz. Prosody-guided temporal importance pooling weights each frame by its F0 and energy content. The SEMLP (Squeeze-Excitation MLP, ~590K parameters) classifies the pooled vector into 6 emotions.</w:t>
+        <w:t>WavLM extracts 768-dim frame-level features at 50 Hz. Prosody-guided temporal importance pooling weights each frame by F0 and energy content. The SEMLP classifier (~590K parameters) maps the pooled vector to 6 emotions.</w:t>
       </w:r>
     </w:p>
     <w:p>
@@ -164,12 +198,7 @@
     </w:p>
     <w:p>
       <w:r>
-        <w:t>For each frame at time t, we extract F0 via YIN algorithm (65-2093 Hz) and RMS energy. These 2-dim prosody features are projected to 64 dimensions, concatenated with the 768-dim SSL feature (832-dim total), and passed through a 2-layer MLP (832→128→1) to produce a scalar attention score per frame. After softmax normalization across the time axis, the attention weights are used to compute a weighted sum of the SSL features.</w:t>
-      </w:r>
-    </w:p>
-    <w:p>
-      <w:r>
-        <w:t>The key design choice is the explicit injection of prosodic information into the attention mechanism, rather than letting the model learn attention purely from SSL features. This forces the model to attend to frames based on their prosodic content — which is where children's emotional information is concentrated.</w:t>
+        <w:t>For each frame, we extract F0 via YIN algorithm (65–2093 Hz) and RMS energy. The 2-dim prosody features are projected to 64 dimensions, concatenated with 768-dim SSL features (832-dim total), and passed through a 2-layer MLP (832→128→1) to produce scalar attention scores. After softmax normalization, weighted summation produces a global vector. F0 and energy are normalized to [0, 1] before projection.</w:t>
       </w:r>
     </w:p>
     <w:p>
@@ -182,17 +211,12 @@
     </w:p>
     <w:p>
       <w:r>
-        <w:t>We quantify distribution shift using Frechet Distance:</w:t>
+        <w:t>FD = ||μ₁ − μ₂||² + Tr(Σ₁ + Σ₂ − 2(Σ₁Σ₂)^½)</w:t>
       </w:r>
     </w:p>
     <w:p>
       <w:r>
-        <w:t>FD = ||μ₁ - μ₂||² + Tr(Σ₁ + Σ₂ - 2(Σ₁Σ₂)^½)</w:t>
-      </w:r>
-    </w:p>
-    <w:p>
-      <w:r>
-        <w:t>computed between SSL feature distributions of two domains. Lower FD indicates more similar distributions.</w:t>
+        <w:t>We compute FD across three dimensions: FD_age (child vs. adult), FD_aug (clean vs. augmented), and FD_lang (English vs. Telugu).</w:t>
       </w:r>
     </w:p>
     <w:p>
@@ -221,22 +245,34 @@
     </w:p>
     <w:p>
       <w:r>
-        <w:t>Datasets. C-BESD (children 6-12, English+Telugu, 6 emotions, 4,179 utterances), IEMOCAP (adults, naturalistic, 9,903 utterances), CREMA-D (adults, portrayed, 7,442 utterances).</w:t>
+        <w:t>Datasets: C-BESD (children 6–12, English+Telugu, portrayed, 6 classes, 4,179 utterances) [5]; IEMOCAP (adults, naturalistic dyadic, 6 classes, 9,903 utterances; we map original 10 labels to 6 classes with excite→HAPPY, frustration→ANGER, not fully comparable with standard 4-class); CREMA-D (adults, portrayed, 6 classes, 7,442 utterances).</w:t>
       </w:r>
     </w:p>
     <w:p>
       <w:r>
-        <w:t>Protocol. Strict speaker-independent split: outer 8:2 trainval/test + inner val, yielding ~6:2:2 ratio. Test set held out until final evaluation. Adapter statistical prior computed from training speakers only. Three seeds (42, 123, 456), mean ± std reported.</w:t>
+        <w:t>Protocol: Strict speaker-independent split: outer 8:2 trainval/test + inner val, resulting in ~6:2:2. Test set isolated. Adapter prior computed from training speakers only. Three seeds (42, 123, 456), mean±std reported.</w:t>
       </w:r>
     </w:p>
     <w:p>
       <w:r>
-        <w:t>Model. WavLM-base-sv (94M, frozen). Prosody pooling (~10K params). SEMLP classifier (~590K params). Total trainable: ~600K. AdamW (lr=3e-4, wd=1e-3), CosineAnnealing, label smoothing 0.1, batch 128, patience 15.</w:t>
+        <w:t>Model: WavLM-base-sv (94M, frozen). Prosody pooling (~10K). SEMLP (~590K). Total trainable: ~600K. AdamW (lr=3e-4, wd=1e-3), CosineAnnealing, label smoothing 0.1, batch 128, patience 15.</w:t>
       </w:r>
     </w:p>
     <w:p>
       <w:r>
-        <w:t>Metrics. Weighted Accuracy (WA) and Unweighted Average Recall (UAR). C-BESD is class-balanced (WA ≈ UAR). Both reported throughout.</w:t>
+        <w:t>Metrics: UAR (primary, standard for SER) and WA (secondary). C-BESD is class-balanced (WA≈UAR). Differences in percentage points.</w:t>
+      </w:r>
+    </w:p>
+    <w:p>
+      <w:pPr>
+        <w:ind w:left="567"/>
+      </w:pPr>
+      <w:r>
+        <w:rPr>
+          <w:i/>
+          <w:sz w:val="20"/>
+        </w:rPr>
+        <w:t>**Note on absolute accuracy**: Our numbers are lower than some published results because we use (1) strictly frozen backbones, (2) rigorous speaker-independent splits, and (3) full 6-class evaluation. Under comparable conditions our results align with prior work [2, 3].</w:t>
       </w:r>
     </w:p>
     <w:p>
@@ -340,7 +376,7 @@
               <w:rPr>
                 <w:sz w:val="20"/>
               </w:rPr>
-              <w:t>50.2</w:t>
+              <w:t>50.2 ± 0.6</w:t>
             </w:r>
           </w:p>
         </w:tc>
@@ -356,7 +392,7 @@
               <w:rPr>
                 <w:sz w:val="20"/>
               </w:rPr>
-              <w:t>50.3</w:t>
+              <w:t>50.3 ± 0.6</w:t>
             </w:r>
           </w:p>
         </w:tc>
@@ -474,7 +510,7 @@
               <w:rPr>
                 <w:sz w:val="20"/>
               </w:rPr>
-              <w:t>A2b: + Adapter (rand)</w:t>
+              <w:t>A2 (stat-prior): + Adapter</w:t>
             </w:r>
           </w:p>
         </w:tc>
@@ -490,7 +526,57 @@
               <w:rPr>
                 <w:sz w:val="20"/>
               </w:rPr>
-              <w:t>78.8 ± 0.8</w:t>
+              <w:t>78.3 ± 0.8</w:t>
+            </w:r>
+          </w:p>
+        </w:tc>
+        <w:tc>
+          <w:tcPr>
+            <w:tcW w:type="dxa" w:w="2767"/>
+          </w:tcPr>
+          <w:p>
+            <w:pPr>
+              <w:jc w:val="center"/>
+            </w:pPr>
+            <w:r>
+              <w:rPr>
+                <w:sz w:val="20"/>
+              </w:rPr>
+              <w:t>—</w:t>
+            </w:r>
+          </w:p>
+        </w:tc>
+      </w:tr>
+      <w:tr>
+        <w:tc>
+          <w:tcPr>
+            <w:tcW w:type="dxa" w:w="2767"/>
+          </w:tcPr>
+          <w:p>
+            <w:pPr>
+              <w:jc w:val="center"/>
+            </w:pPr>
+            <w:r>
+              <w:rPr>
+                <w:sz w:val="20"/>
+              </w:rPr>
+              <w:t>A2b (random): + Adapter</w:t>
+            </w:r>
+          </w:p>
+        </w:tc>
+        <w:tc>
+          <w:tcPr>
+            <w:tcW w:type="dxa" w:w="2767"/>
+          </w:tcPr>
+          <w:p>
+            <w:pPr>
+              <w:jc w:val="center"/>
+            </w:pPr>
+            <w:r>
+              <w:rPr>
+                <w:sz w:val="20"/>
+              </w:rPr>
+              <w:t>78.4 ± 0.5</w:t>
             </w:r>
           </w:p>
         </w:tc>
@@ -574,6 +660,54 @@
               <w:rPr>
                 <w:sz w:val="20"/>
               </w:rPr>
+            </w:r>
+          </w:p>
+        </w:tc>
+        <w:tc>
+          <w:tcPr>
+            <w:tcW w:type="dxa" w:w="2767"/>
+          </w:tcPr>
+          <w:p>
+            <w:pPr>
+              <w:jc w:val="center"/>
+            </w:pPr>
+            <w:r>
+              <w:rPr>
+                <w:sz w:val="20"/>
+              </w:rPr>
+              <w:t>(Δ=+2.23, 95% CI [1.41, 3.64])</w:t>
+            </w:r>
+          </w:p>
+        </w:tc>
+        <w:tc>
+          <w:tcPr>
+            <w:tcW w:type="dxa" w:w="2767"/>
+          </w:tcPr>
+          <w:p>
+            <w:pPr>
+              <w:jc w:val="center"/>
+            </w:pPr>
+            <w:r>
+              <w:rPr>
+                <w:sz w:val="20"/>
+              </w:rPr>
+            </w:r>
+          </w:p>
+        </w:tc>
+      </w:tr>
+      <w:tr>
+        <w:tc>
+          <w:tcPr>
+            <w:tcW w:type="dxa" w:w="2767"/>
+          </w:tcPr>
+          <w:p>
+            <w:pPr>
+              <w:jc w:val="center"/>
+            </w:pPr>
+            <w:r>
+              <w:rPr>
+                <w:sz w:val="20"/>
+              </w:rPr>
               <w:t>B3: + Adapter + Prosody</w:t>
             </w:r>
           </w:p>
@@ -615,7 +749,7 @@
     <w:p/>
     <w:p>
       <w:r>
-        <w:t>The MFCC+CNN baseline achieves only 50.2% under strict speaker-independent evaluation, suggesting the published 76% may involve speaker overlap. WavLM alone provides +28pp. Prosody pooling adds +2.2pp (A1→A3). The Adapter contributes only +0.6pp (A3→B3), within noise range.</w:t>
+        <w:t>The MFCC+CNN baseline achieves only 50.2% under strict speaker-independent evaluation; the published 76% [5] did not specify the split protocol, making direct comparison impossible. WavLM alone contributes ~28 percentage points. Prosody pooling adds +2.2 pp. Both Adapter initializations produce results within noise of A1 (differences &lt;0.3 pp); stat-prior is slightly worse than random. B3 has the highest mean (81.5%) but marginal gain over A3 (+0.6 pp) is smaller than run-to-run variance (std=1.1) and adds ~300K parameters. We recommend A3 as the lightweight model.</w:t>
       </w:r>
     </w:p>
     <w:p>
@@ -623,7 +757,7 @@
         <w:pStyle w:val="Heading4"/>
       </w:pPr>
       <w:r>
-        <w:t>4.3 Cross-Dataset Analysis: Age × Style Interaction</w:t>
+        <w:t>4.3 Cross-Dataset Comparison</w:t>
       </w:r>
     </w:p>
     <w:tbl>
@@ -671,7 +805,7 @@
                 <w:b/>
                 <w:sz w:val="20"/>
               </w:rPr>
-              <w:t>Population</w:t>
+              <w:t>Speakers</w:t>
             </w:r>
           </w:p>
         </w:tc>
@@ -688,7 +822,7 @@
                 <w:b/>
                 <w:sz w:val="20"/>
               </w:rPr>
-              <w:t>Style</w:t>
+              <w:t>Emotion Type</w:t>
             </w:r>
           </w:p>
         </w:tc>
@@ -705,7 +839,7 @@
                 <w:b/>
                 <w:sz w:val="20"/>
               </w:rPr>
-              <w:t>A1 WA</w:t>
+              <w:t>A1 WA/UAR</w:t>
             </w:r>
           </w:p>
         </w:tc>
@@ -722,7 +856,7 @@
                 <w:b/>
                 <w:sz w:val="20"/>
               </w:rPr>
-              <w:t>A3 WA</w:t>
+              <w:t>A3 WA/UAR</w:t>
             </w:r>
           </w:p>
         </w:tc>
@@ -789,7 +923,7 @@
               <w:rPr>
                 <w:sz w:val="20"/>
               </w:rPr>
-              <w:t>Acted</w:t>
+              <w:t>Portrayed</w:t>
             </w:r>
           </w:p>
         </w:tc>
@@ -805,7 +939,7 @@
               <w:rPr>
                 <w:sz w:val="20"/>
               </w:rPr>
-              <w:t>78.6%</w:t>
+              <w:t>78.6/78.6</w:t>
             </w:r>
           </w:p>
         </w:tc>
@@ -821,7 +955,7 @@
               <w:rPr>
                 <w:sz w:val="20"/>
               </w:rPr>
-              <w:t>80.9%</w:t>
+              <w:t>80.9/80.8</w:t>
             </w:r>
           </w:p>
         </w:tc>
@@ -887,7 +1021,7 @@
               <w:rPr>
                 <w:sz w:val="20"/>
               </w:rPr>
-              <w:t>Acted</w:t>
+              <w:t>Portrayed</w:t>
             </w:r>
           </w:p>
         </w:tc>
@@ -903,7 +1037,7 @@
               <w:rPr>
                 <w:sz w:val="20"/>
               </w:rPr>
-              <w:t>64.7%</w:t>
+              <w:t>64.7/64.9</w:t>
             </w:r>
           </w:p>
         </w:tc>
@@ -919,7 +1053,7 @@
               <w:rPr>
                 <w:sz w:val="20"/>
               </w:rPr>
-              <w:t>65.4%</w:t>
+              <w:t>65.4/65.6</w:t>
             </w:r>
           </w:p>
         </w:tc>
@@ -953,7 +1087,7 @@
               <w:rPr>
                 <w:sz w:val="20"/>
               </w:rPr>
-              <w:t>IEMOCAP</w:t>
+              <w:t>IEMOCAP 6-cls</w:t>
             </w:r>
           </w:p>
         </w:tc>
@@ -985,7 +1119,7 @@
               <w:rPr>
                 <w:sz w:val="20"/>
               </w:rPr>
-              <w:t>Improvised</w:t>
+              <w:t>Naturalistic</w:t>
             </w:r>
           </w:p>
         </w:tc>
@@ -1001,7 +1135,7 @@
               <w:rPr>
                 <w:sz w:val="20"/>
               </w:rPr>
-              <w:t>54.5%</w:t>
+              <w:t>54.5/—</w:t>
             </w:r>
           </w:p>
         </w:tc>
@@ -1017,7 +1151,7 @@
               <w:rPr>
                 <w:sz w:val="20"/>
               </w:rPr>
-              <w:t>52.4%</w:t>
+              <w:t>52.4/—</w:t>
             </w:r>
           </w:p>
         </w:tc>
@@ -1033,7 +1167,105 @@
               <w:rPr>
                 <w:sz w:val="20"/>
               </w:rPr>
-              <w:t>-2.12</w:t>
+              <w:t>−2.12</w:t>
+            </w:r>
+          </w:p>
+        </w:tc>
+      </w:tr>
+      <w:tr>
+        <w:tc>
+          <w:tcPr>
+            <w:tcW w:type="dxa" w:w="1383"/>
+          </w:tcPr>
+          <w:p>
+            <w:pPr>
+              <w:jc w:val="center"/>
+            </w:pPr>
+            <w:r>
+              <w:rPr>
+                <w:sz w:val="20"/>
+              </w:rPr>
+              <w:t>IEMOCAP 4-cls</w:t>
+            </w:r>
+          </w:p>
+        </w:tc>
+        <w:tc>
+          <w:tcPr>
+            <w:tcW w:type="dxa" w:w="1383"/>
+          </w:tcPr>
+          <w:p>
+            <w:pPr>
+              <w:jc w:val="center"/>
+            </w:pPr>
+            <w:r>
+              <w:rPr>
+                <w:sz w:val="20"/>
+              </w:rPr>
+              <w:t>Adults</w:t>
+            </w:r>
+          </w:p>
+        </w:tc>
+        <w:tc>
+          <w:tcPr>
+            <w:tcW w:type="dxa" w:w="1383"/>
+          </w:tcPr>
+          <w:p>
+            <w:pPr>
+              <w:jc w:val="center"/>
+            </w:pPr>
+            <w:r>
+              <w:rPr>
+                <w:sz w:val="20"/>
+              </w:rPr>
+              <w:t>Naturalistic</w:t>
+            </w:r>
+          </w:p>
+        </w:tc>
+        <w:tc>
+          <w:tcPr>
+            <w:tcW w:type="dxa" w:w="1383"/>
+          </w:tcPr>
+          <w:p>
+            <w:pPr>
+              <w:jc w:val="center"/>
+            </w:pPr>
+            <w:r>
+              <w:rPr>
+                <w:sz w:val="20"/>
+              </w:rPr>
+              <w:t>54.2/51.4</w:t>
+            </w:r>
+          </w:p>
+        </w:tc>
+        <w:tc>
+          <w:tcPr>
+            <w:tcW w:type="dxa" w:w="1383"/>
+          </w:tcPr>
+          <w:p>
+            <w:pPr>
+              <w:jc w:val="center"/>
+            </w:pPr>
+            <w:r>
+              <w:rPr>
+                <w:sz w:val="20"/>
+              </w:rPr>
+              <w:t>55.2/52.5</w:t>
+            </w:r>
+          </w:p>
+        </w:tc>
+        <w:tc>
+          <w:tcPr>
+            <w:tcW w:type="dxa" w:w="1383"/>
+          </w:tcPr>
+          <w:p>
+            <w:pPr>
+              <w:jc w:val="center"/>
+            </w:pPr>
+            <w:r>
+              <w:rPr>
+                <w:sz w:val="20"/>
+              </w:rPr>
+              <w:t>+1.02</w:t>
             </w:r>
           </w:p>
         </w:tc>
@@ -1042,7 +1274,304 @@
     <w:p/>
     <w:p>
       <w:r>
-        <w:t>Three key observations: (1) Prosody pooling consistently benefits portrayed speech, with children gaining 3× more than adults. (2) For naturalistic/natural speech (IEMOCAP), prosody pooling is harmful — naturalistic prosody may be less reliably linked to emotion. (3) The baseline accuracy gap (C-BESD 78.6% vs. CREMA-D 64.7%) confirms that children's portrayed emotions are acoustically more distinctive than adults'.</w:t>
+        <w:t>Note: IEMOCAP 6-cls UAR not separately recorded (single run); IEMOCAP 4-cls and CREMA-D are single-seed runs.</w:t>
+      </w:r>
+    </w:p>
+    <w:p>
+      <w:r>
+        <w:t>Observations: (1) Prosody pooling consistently benefits portrayed speech, with children gaining ~3× more than adults. (2) IEMOCAP 6-class negative turns positive on 4-class (+1.02 pp), indicating DISGUST and FEAR difficulty—not recording style—drives the 6-class result.</w:t>
+      </w:r>
+    </w:p>
+    <w:p>
+      <w:r>
+        <w:t>Acoustic comparison:</w:t>
+      </w:r>
+    </w:p>
+    <w:tbl>
+      <w:tblPr>
+        <w:tblStyle w:val="LightGrid-Accent1"/>
+        <w:tblW w:type="auto" w:w="0"/>
+        <w:tblLook w:firstColumn="1" w:firstRow="1" w:lastColumn="0" w:lastRow="0" w:noHBand="0" w:noVBand="1" w:val="04A0"/>
+      </w:tblPr>
+      <w:tblGrid>
+        <w:gridCol w:w="2075"/>
+        <w:gridCol w:w="2075"/>
+        <w:gridCol w:w="2075"/>
+        <w:gridCol w:w="2075"/>
+      </w:tblGrid>
+      <w:tr>
+        <w:tc>
+          <w:tcPr>
+            <w:tcW w:type="dxa" w:w="2075"/>
+          </w:tcPr>
+          <w:p>
+            <w:pPr>
+              <w:jc w:val="center"/>
+            </w:pPr>
+            <w:r>
+              <w:rPr>
+                <w:b/>
+                <w:sz w:val="20"/>
+              </w:rPr>
+              <w:t>Dataset</w:t>
+            </w:r>
+          </w:p>
+        </w:tc>
+        <w:tc>
+          <w:tcPr>
+            <w:tcW w:type="dxa" w:w="2075"/>
+          </w:tcPr>
+          <w:p>
+            <w:pPr>
+              <w:jc w:val="center"/>
+            </w:pPr>
+            <w:r>
+              <w:rPr>
+                <w:b/>
+                <w:sz w:val="20"/>
+              </w:rPr>
+              <w:t>F0 Median (Hz)</w:t>
+            </w:r>
+          </w:p>
+        </w:tc>
+        <w:tc>
+          <w:tcPr>
+            <w:tcW w:type="dxa" w:w="2075"/>
+          </w:tcPr>
+          <w:p>
+            <w:pPr>
+              <w:jc w:val="center"/>
+            </w:pPr>
+            <w:r>
+              <w:rPr>
+                <w:b/>
+                <w:sz w:val="20"/>
+              </w:rPr>
+              <w:t>F0 Range (Hz)</w:t>
+            </w:r>
+          </w:p>
+        </w:tc>
+        <w:tc>
+          <w:tcPr>
+            <w:tcW w:type="dxa" w:w="2075"/>
+          </w:tcPr>
+          <w:p>
+            <w:pPr>
+              <w:jc w:val="center"/>
+            </w:pPr>
+            <w:r>
+              <w:rPr>
+                <w:b/>
+                <w:sz w:val="20"/>
+              </w:rPr>
+              <w:t>Energy Mean</w:t>
+            </w:r>
+          </w:p>
+        </w:tc>
+      </w:tr>
+      <w:tr>
+        <w:tc>
+          <w:tcPr>
+            <w:tcW w:type="dxa" w:w="2075"/>
+          </w:tcPr>
+          <w:p>
+            <w:pPr>
+              <w:jc w:val="center"/>
+            </w:pPr>
+            <w:r>
+              <w:rPr>
+                <w:sz w:val="20"/>
+              </w:rPr>
+              <w:t>C-BESD (children)</w:t>
+            </w:r>
+          </w:p>
+        </w:tc>
+        <w:tc>
+          <w:tcPr>
+            <w:tcW w:type="dxa" w:w="2075"/>
+          </w:tcPr>
+          <w:p>
+            <w:pPr>
+              <w:jc w:val="center"/>
+            </w:pPr>
+            <w:r>
+              <w:rPr>
+                <w:sz w:val="20"/>
+              </w:rPr>
+              <w:t>340</w:t>
+            </w:r>
+          </w:p>
+        </w:tc>
+        <w:tc>
+          <w:tcPr>
+            <w:tcW w:type="dxa" w:w="2075"/>
+          </w:tcPr>
+          <w:p>
+            <w:pPr>
+              <w:jc w:val="center"/>
+            </w:pPr>
+            <w:r>
+              <w:rPr>
+                <w:sz w:val="20"/>
+              </w:rPr>
+              <w:t>137–2286</w:t>
+            </w:r>
+          </w:p>
+        </w:tc>
+        <w:tc>
+          <w:tcPr>
+            <w:tcW w:type="dxa" w:w="2075"/>
+          </w:tcPr>
+          <w:p>
+            <w:pPr>
+              <w:jc w:val="center"/>
+            </w:pPr>
+            <w:r>
+              <w:rPr>
+                <w:sz w:val="20"/>
+              </w:rPr>
+              <w:t>0.030</w:t>
+            </w:r>
+          </w:p>
+        </w:tc>
+      </w:tr>
+      <w:tr>
+        <w:tc>
+          <w:tcPr>
+            <w:tcW w:type="dxa" w:w="2075"/>
+          </w:tcPr>
+          <w:p>
+            <w:pPr>
+              <w:jc w:val="center"/>
+            </w:pPr>
+            <w:r>
+              <w:rPr>
+                <w:sz w:val="20"/>
+              </w:rPr>
+              <w:t>CREMA-D (adults, portrayed)</w:t>
+            </w:r>
+          </w:p>
+        </w:tc>
+        <w:tc>
+          <w:tcPr>
+            <w:tcW w:type="dxa" w:w="2075"/>
+          </w:tcPr>
+          <w:p>
+            <w:pPr>
+              <w:jc w:val="center"/>
+            </w:pPr>
+            <w:r>
+              <w:rPr>
+                <w:sz w:val="20"/>
+              </w:rPr>
+              <w:t>223</w:t>
+            </w:r>
+          </w:p>
+        </w:tc>
+        <w:tc>
+          <w:tcPr>
+            <w:tcW w:type="dxa" w:w="2075"/>
+          </w:tcPr>
+          <w:p>
+            <w:pPr>
+              <w:jc w:val="center"/>
+            </w:pPr>
+            <w:r>
+              <w:rPr>
+                <w:sz w:val="20"/>
+              </w:rPr>
+              <w:t>85–2286</w:t>
+            </w:r>
+          </w:p>
+        </w:tc>
+        <w:tc>
+          <w:tcPr>
+            <w:tcW w:type="dxa" w:w="2075"/>
+          </w:tcPr>
+          <w:p>
+            <w:pPr>
+              <w:jc w:val="center"/>
+            </w:pPr>
+            <w:r>
+              <w:rPr>
+                <w:sz w:val="20"/>
+              </w:rPr>
+              <w:t>0.018</w:t>
+            </w:r>
+          </w:p>
+        </w:tc>
+      </w:tr>
+      <w:tr>
+        <w:tc>
+          <w:tcPr>
+            <w:tcW w:type="dxa" w:w="2075"/>
+          </w:tcPr>
+          <w:p>
+            <w:pPr>
+              <w:jc w:val="center"/>
+            </w:pPr>
+            <w:r>
+              <w:rPr>
+                <w:sz w:val="20"/>
+              </w:rPr>
+              <w:t>IEMOCAP (adults, naturalistic)</w:t>
+            </w:r>
+          </w:p>
+        </w:tc>
+        <w:tc>
+          <w:tcPr>
+            <w:tcW w:type="dxa" w:w="2075"/>
+          </w:tcPr>
+          <w:p>
+            <w:pPr>
+              <w:jc w:val="center"/>
+            </w:pPr>
+            <w:r>
+              <w:rPr>
+                <w:sz w:val="20"/>
+              </w:rPr>
+              <w:t>232</w:t>
+            </w:r>
+          </w:p>
+        </w:tc>
+        <w:tc>
+          <w:tcPr>
+            <w:tcW w:type="dxa" w:w="2075"/>
+          </w:tcPr>
+          <w:p>
+            <w:pPr>
+              <w:jc w:val="center"/>
+            </w:pPr>
+            <w:r>
+              <w:rPr>
+                <w:sz w:val="20"/>
+              </w:rPr>
+              <w:t>0–2286</w:t>
+            </w:r>
+          </w:p>
+        </w:tc>
+        <w:tc>
+          <w:tcPr>
+            <w:tcW w:type="dxa" w:w="2075"/>
+          </w:tcPr>
+          <w:p>
+            <w:pPr>
+              <w:jc w:val="center"/>
+            </w:pPr>
+            <w:r>
+              <w:rPr>
+                <w:sz w:val="20"/>
+              </w:rPr>
+              <w:t>0.020</w:t>
+            </w:r>
+          </w:p>
+        </w:tc>
+      </w:tr>
+    </w:tbl>
+    <w:p/>
+    <w:p>
+      <w:r>
+        <w:t>Note: F0 means are inflated by YIN artifacts at fmax=2093 Hz (C-BESD mean=1068, CREMA-D mean=933). Medians are the reliable central tendency. Children's F0 median is ~1.5× higher than adults', with greater variance.</w:t>
       </w:r>
     </w:p>
     <w:p>
@@ -1214,7 +1743,7 @@
               <w:rPr>
                 <w:sz w:val="20"/>
               </w:rPr>
-              <w:t>wav2vec2</w:t>
+              <w:t>wav2vec 2.0</w:t>
             </w:r>
           </w:p>
         </w:tc>
@@ -1262,7 +1791,7 @@
               <w:rPr>
                 <w:sz w:val="20"/>
               </w:rPr>
-              <w:t>-0.5</w:t>
+              <w:t>−0.5</w:t>
             </w:r>
           </w:p>
         </w:tc>
@@ -1271,7 +1800,7 @@
     <w:p/>
     <w:p>
       <w:r>
-        <w:t>WavLM substantially outperforms wav2vec2 (gap = 22pp) on children's speech, validating our backbone choice. HuBERT was not tested due to model availability constraints.</w:t>
+        <w:t>WavLM substantially outperforms wav2vec 2.0 (22 pp gap). HuBERT not tested due to model availability.</w:t>
       </w:r>
     </w:p>
     <w:p>
@@ -1284,7 +1813,7 @@
     </w:p>
     <w:p>
       <w:r>
-        <w:t>Four augmentation conditions applied to the training set (B3 configuration):</w:t>
+        <w:t>Four augmentation conditions (B3 configuration):</w:t>
       </w:r>
     </w:p>
     <w:tbl>
@@ -1364,7 +1893,7 @@
                 <w:b/>
                 <w:sz w:val="20"/>
               </w:rPr>
-              <w:t>Δ vs Clean</w:t>
+              <w:t>vs C1</w:t>
             </w:r>
           </w:p>
         </w:tc>
@@ -1496,7 +2025,7 @@
               <w:rPr>
                 <w:sz w:val="20"/>
               </w:rPr>
-              <w:t>-21.5</w:t>
+              <w:t>−21.5</w:t>
             </w:r>
           </w:p>
         </w:tc>
@@ -1562,7 +2091,7 @@
               <w:rPr>
                 <w:sz w:val="20"/>
               </w:rPr>
-              <w:t>-28.0</w:t>
+              <w:t>−28.0</w:t>
             </w:r>
           </w:p>
         </w:tc>
@@ -1628,7 +2157,7 @@
               <w:rPr>
                 <w:sz w:val="20"/>
               </w:rPr>
-              <w:t>-33.4</w:t>
+              <w:t>−33.4</w:t>
             </w:r>
           </w:p>
         </w:tc>
@@ -1637,7 +2166,7 @@
     <w:p/>
     <w:p>
       <w:r>
-        <w:t>All augmentation is harmful, even with child-constrained parameters. The monotonic FD-Accuracy relationship confirms that distribution shift quantitatively predicts performance degradation.</w:t>
+        <w:t>Under our experimental conditions, all augmentation degrades performance, even with child-statistics-constrained parameters. The four data points show a monotonic FD-Accuracy relationship, suggesting FD as a potential risk indicator.</w:t>
       </w:r>
     </w:p>
     <w:p>
@@ -1645,7 +2174,19 @@
         <w:pStyle w:val="Heading4"/>
       </w:pPr>
       <w:r>
-        <w:t>4.6 Cross-Language Transfer</w:t>
+        <w:t>4.6 Cross-Language Preliminary Analysis</w:t>
+      </w:r>
+    </w:p>
+    <w:p>
+      <w:pPr>
+        <w:ind w:left="567"/>
+      </w:pPr>
+      <w:r>
+        <w:rPr>
+          <w:i/>
+          <w:sz w:val="20"/>
+        </w:rPr>
+        <w:t>Note: These experiments use the historical 60/20/20 protocol, while all other experiments use 6:2:2. Presented as preliminary analysis.</w:t>
       </w:r>
     </w:p>
     <w:tbl>
@@ -1673,7 +2214,7 @@
                 <w:b/>
                 <w:sz w:val="20"/>
               </w:rPr>
-              <w:t>Training</w:t>
+              <w:t>Train</w:t>
             </w:r>
           </w:p>
         </w:tc>
@@ -1690,7 +2231,7 @@
                 <w:b/>
                 <w:sz w:val="20"/>
               </w:rPr>
-              <w:t>Testing</w:t>
+              <w:t>Test</w:t>
             </w:r>
           </w:p>
         </w:tc>
@@ -1866,7 +2407,7 @@
     <w:p/>
     <w:p>
       <w:r>
-        <w:t>Language shift causes catastrophic failure (near-chance for EN→TE). This represents an FD of approximately 137 — two orders of magnitude larger than augmentation-induced FD — explaining the extreme degradation.</w:t>
+        <w:t>Language shift causes near-complete classification failure. FD between English and Telugu subsets measures 16.48—higher than augmentation FD (max 12.0) but far smaller than the performance gap would suggest (−61 pp vs. −33 pp), indicating that language shift involves factors beyond FD-captured distribution differences.</w:t>
       </w:r>
     </w:p>
     <w:p>
@@ -1884,14 +2425,15 @@
         <w:tblLook w:firstColumn="1" w:firstRow="1" w:lastColumn="0" w:lastRow="0" w:noHBand="0" w:noVBand="1" w:val="04A0"/>
       </w:tblPr>
       <w:tblGrid>
-        <w:gridCol w:w="2767"/>
-        <w:gridCol w:w="2767"/>
-        <w:gridCol w:w="2767"/>
+        <w:gridCol w:w="2075"/>
+        <w:gridCol w:w="2075"/>
+        <w:gridCol w:w="2075"/>
+        <w:gridCol w:w="2075"/>
       </w:tblGrid>
       <w:tr>
         <w:tc>
           <w:tcPr>
-            <w:tcW w:type="dxa" w:w="2767"/>
+            <w:tcW w:type="dxa" w:w="2075"/>
           </w:tcPr>
           <w:p>
             <w:pPr>
@@ -1908,7 +2450,7 @@
         </w:tc>
         <w:tc>
           <w:tcPr>
-            <w:tcW w:type="dxa" w:w="2767"/>
+            <w:tcW w:type="dxa" w:w="2075"/>
           </w:tcPr>
           <w:p>
             <w:pPr>
@@ -1919,13 +2461,13 @@
                 <w:b/>
                 <w:sz w:val="20"/>
               </w:rPr>
-              <w:t>Entropy</w:t>
+              <w:t>Attention Entropy</w:t>
             </w:r>
           </w:p>
         </w:tc>
         <w:tc>
           <w:tcPr>
-            <w:tcW w:type="dxa" w:w="2767"/>
+            <w:tcW w:type="dxa" w:w="2075"/>
           </w:tcPr>
           <w:p>
             <w:pPr>
@@ -1940,11 +2482,28 @@
             </w:r>
           </w:p>
         </w:tc>
+        <w:tc>
+          <w:tcPr>
+            <w:tcW w:type="dxa" w:w="2075"/>
+          </w:tcPr>
+          <w:p>
+            <w:pPr>
+              <w:jc w:val="center"/>
+            </w:pPr>
+            <w:r>
+              <w:rPr>
+                <w:b/>
+                <w:sz w:val="20"/>
+              </w:rPr>
+              <w:t>F0 Characteristic</w:t>
+            </w:r>
+          </w:p>
+        </w:tc>
       </w:tr>
       <w:tr>
         <w:tc>
           <w:tcPr>
-            <w:tcW w:type="dxa" w:w="2767"/>
+            <w:tcW w:type="dxa" w:w="2075"/>
           </w:tcPr>
           <w:p>
             <w:pPr>
@@ -1960,7 +2519,7 @@
         </w:tc>
         <w:tc>
           <w:tcPr>
-            <w:tcW w:type="dxa" w:w="2767"/>
+            <w:tcW w:type="dxa" w:w="2075"/>
           </w:tcPr>
           <w:p>
             <w:pPr>
@@ -1976,7 +2535,7 @@
         </w:tc>
         <w:tc>
           <w:tcPr>
-            <w:tcW w:type="dxa" w:w="2767"/>
+            <w:tcW w:type="dxa" w:w="2075"/>
           </w:tcPr>
           <w:p>
             <w:pPr>
@@ -1990,11 +2549,27 @@
             </w:r>
           </w:p>
         </w:tc>
+        <w:tc>
+          <w:tcPr>
+            <w:tcW w:type="dxa" w:w="2075"/>
+          </w:tcPr>
+          <w:p>
+            <w:pPr>
+              <w:jc w:val="center"/>
+            </w:pPr>
+            <w:r>
+              <w:rPr>
+                <w:sz w:val="20"/>
+              </w:rPr>
+              <w:t>High-energy bursts</w:t>
+            </w:r>
+          </w:p>
+        </w:tc>
       </w:tr>
       <w:tr>
         <w:tc>
           <w:tcPr>
-            <w:tcW w:type="dxa" w:w="2767"/>
+            <w:tcW w:type="dxa" w:w="2075"/>
           </w:tcPr>
           <w:p>
             <w:pPr>
@@ -2010,7 +2585,7 @@
         </w:tc>
         <w:tc>
           <w:tcPr>
-            <w:tcW w:type="dxa" w:w="2767"/>
+            <w:tcW w:type="dxa" w:w="2075"/>
           </w:tcPr>
           <w:p>
             <w:pPr>
@@ -2026,7 +2601,7 @@
         </w:tc>
         <w:tc>
           <w:tcPr>
-            <w:tcW w:type="dxa" w:w="2767"/>
+            <w:tcW w:type="dxa" w:w="2075"/>
           </w:tcPr>
           <w:p>
             <w:pPr>
@@ -2040,11 +2615,27 @@
             </w:r>
           </w:p>
         </w:tc>
+        <w:tc>
+          <w:tcPr>
+            <w:tcW w:type="dxa" w:w="2075"/>
+          </w:tcPr>
+          <w:p>
+            <w:pPr>
+              <w:jc w:val="center"/>
+            </w:pPr>
+            <w:r>
+              <w:rPr>
+                <w:sz w:val="20"/>
+              </w:rPr>
+              <w:t>F0 fluctuation</w:t>
+            </w:r>
+          </w:p>
+        </w:tc>
       </w:tr>
       <w:tr>
         <w:tc>
           <w:tcPr>
-            <w:tcW w:type="dxa" w:w="2767"/>
+            <w:tcW w:type="dxa" w:w="2075"/>
           </w:tcPr>
           <w:p>
             <w:pPr>
@@ -2060,7 +2651,7 @@
         </w:tc>
         <w:tc>
           <w:tcPr>
-            <w:tcW w:type="dxa" w:w="2767"/>
+            <w:tcW w:type="dxa" w:w="2075"/>
           </w:tcPr>
           <w:p>
             <w:pPr>
@@ -2076,7 +2667,7 @@
         </w:tc>
         <w:tc>
           <w:tcPr>
-            <w:tcW w:type="dxa" w:w="2767"/>
+            <w:tcW w:type="dxa" w:w="2075"/>
           </w:tcPr>
           <w:p>
             <w:pPr>
@@ -2090,11 +2681,27 @@
             </w:r>
           </w:p>
         </w:tc>
+        <w:tc>
+          <w:tcPr>
+            <w:tcW w:type="dxa" w:w="2075"/>
+          </w:tcPr>
+          <w:p>
+            <w:pPr>
+              <w:jc w:val="center"/>
+            </w:pPr>
+            <w:r>
+              <w:rPr>
+                <w:sz w:val="20"/>
+              </w:rPr>
+              <w:t>Low F0 plateau</w:t>
+            </w:r>
+          </w:p>
+        </w:tc>
       </w:tr>
       <w:tr>
         <w:tc>
           <w:tcPr>
-            <w:tcW w:type="dxa" w:w="2767"/>
+            <w:tcW w:type="dxa" w:w="2075"/>
           </w:tcPr>
           <w:p>
             <w:pPr>
@@ -2110,7 +2717,7 @@
         </w:tc>
         <w:tc>
           <w:tcPr>
-            <w:tcW w:type="dxa" w:w="2767"/>
+            <w:tcW w:type="dxa" w:w="2075"/>
           </w:tcPr>
           <w:p>
             <w:pPr>
@@ -2126,7 +2733,7 @@
         </w:tc>
         <w:tc>
           <w:tcPr>
-            <w:tcW w:type="dxa" w:w="2767"/>
+            <w:tcW w:type="dxa" w:w="2075"/>
           </w:tcPr>
           <w:p>
             <w:pPr>
@@ -2140,11 +2747,27 @@
             </w:r>
           </w:p>
         </w:tc>
+        <w:tc>
+          <w:tcPr>
+            <w:tcW w:type="dxa" w:w="2075"/>
+          </w:tcPr>
+          <w:p>
+            <w:pPr>
+              <w:jc w:val="center"/>
+            </w:pPr>
+            <w:r>
+              <w:rPr>
+                <w:sz w:val="20"/>
+              </w:rPr>
+              <w:t>Short, abrupt</w:t>
+            </w:r>
+          </w:p>
+        </w:tc>
       </w:tr>
       <w:tr>
         <w:tc>
           <w:tcPr>
-            <w:tcW w:type="dxa" w:w="2767"/>
+            <w:tcW w:type="dxa" w:w="2075"/>
           </w:tcPr>
           <w:p>
             <w:pPr>
@@ -2160,7 +2783,7 @@
         </w:tc>
         <w:tc>
           <w:tcPr>
-            <w:tcW w:type="dxa" w:w="2767"/>
+            <w:tcW w:type="dxa" w:w="2075"/>
           </w:tcPr>
           <w:p>
             <w:pPr>
@@ -2176,7 +2799,7 @@
         </w:tc>
         <w:tc>
           <w:tcPr>
-            <w:tcW w:type="dxa" w:w="2767"/>
+            <w:tcW w:type="dxa" w:w="2075"/>
           </w:tcPr>
           <w:p>
             <w:pPr>
@@ -2190,11 +2813,27 @@
             </w:r>
           </w:p>
         </w:tc>
+        <w:tc>
+          <w:tcPr>
+            <w:tcW w:type="dxa" w:w="2075"/>
+          </w:tcPr>
+          <w:p>
+            <w:pPr>
+              <w:jc w:val="center"/>
+            </w:pPr>
+            <w:r>
+              <w:rPr>
+                <w:sz w:val="20"/>
+              </w:rPr>
+              <w:t>Flat F0/energy</w:t>
+            </w:r>
+          </w:p>
+        </w:tc>
       </w:tr>
       <w:tr>
         <w:tc>
           <w:tcPr>
-            <w:tcW w:type="dxa" w:w="2767"/>
+            <w:tcW w:type="dxa" w:w="2075"/>
           </w:tcPr>
           <w:p>
             <w:pPr>
@@ -2210,7 +2849,7 @@
         </w:tc>
         <w:tc>
           <w:tcPr>
-            <w:tcW w:type="dxa" w:w="2767"/>
+            <w:tcW w:type="dxa" w:w="2075"/>
           </w:tcPr>
           <w:p>
             <w:pPr>
@@ -2226,7 +2865,7 @@
         </w:tc>
         <w:tc>
           <w:tcPr>
-            <w:tcW w:type="dxa" w:w="2767"/>
+            <w:tcW w:type="dxa" w:w="2075"/>
           </w:tcPr>
           <w:p>
             <w:pPr>
@@ -2240,12 +2879,28 @@
             </w:r>
           </w:p>
         </w:tc>
+        <w:tc>
+          <w:tcPr>
+            <w:tcW w:type="dxa" w:w="2075"/>
+          </w:tcPr>
+          <w:p>
+            <w:pPr>
+              <w:jc w:val="center"/>
+            </w:pPr>
+            <w:r>
+              <w:rPr>
+                <w:sz w:val="20"/>
+              </w:rPr>
+              <w:t>High but dispersed F0 variance</w:t>
+            </w:r>
+          </w:p>
+        </w:tc>
       </w:tr>
     </w:tbl>
     <w:p/>
     <w:p>
       <w:r>
-        <w:t>Attention entropy (lower = more concentrated attention) negatively correlates with per-class accuracy (Pearson r ≈ -0.7). Emotions with more temporally concentrated prosodic cues (ANGER, FEAR) benefit more from prosody-guided attention than those with diffuse cues (HAPPY, NEUTRAL).</w:t>
+        <w:t>Pearson r=−0.52 between entropy and accuracy, but not statistically significant (p=0.30, Spearman ρ=−0.43, p=0.40, N=6). We report this as an exploratory observation, not a confirmed finding.</w:t>
       </w:r>
     </w:p>
     <w:p>
@@ -2253,12 +2908,12 @@
         <w:pStyle w:val="Heading4"/>
       </w:pPr>
       <w:r>
-        <w:t>4.8 Unified FD-Accuracy Framework</w:t>
+        <w:t>4.8 Cross-Dimensional FD-Accuracy Observation</w:t>
       </w:r>
     </w:p>
     <w:p>
       <w:r>
-        <w:t>Plotting FD against accuracy for all three shift dimensions reveals a unified monotonic relationship. The FD-Accuracy curve serves as a predictive tool: given a new distribution shift source, FD measurement predicts the expected accuracy degradation. Language shift produces the largest FD (&gt;100), explaining why it remains the hardest unsolved dimension.</w:t>
+        <w:t>Plotting all data points across three shift dimensions on unified FD-Accuracy axes shows a consistent monotonic trend. However, the limited number of data points (age: 2, augmentation: 4, language: 1) and the nonlinear FD-accuracy relationship for language shift (FD only slightly larger, but accuracy drop much more severe) suggest this trend requires further validation.</w:t>
       </w:r>
     </w:p>
     <w:p>
@@ -2279,17 +2934,12 @@
     </w:p>
     <w:p>
       <w:r>
-        <w:t>Why does prosody pooling help children more? Children's F0 range (75-2285 Hz) is substantially wider than adults' (80-220 Hz). The higher variance in children's prosody makes frame-level F0/energy a more informative signal for attention weighting. In naturalistic adult speech, subtle prosodic variations may not reliably indicate emotional content.</w:t>
+        <w:t>Why larger gains for children? C-BESD children's F0 median (~340 Hz) is ~1.5× higher than adults' (~223–232 Hz), with greater variance. Higher prosodic variability makes frame-level F0/energy a more informative attention signal. For IEMOCAP, the 6-class negative turning to 4-class positive suggests DISGUST and FEAR are inherently difficult to distinguish via prosody alone in naturalistic conversation.</w:t>
       </w:r>
     </w:p>
     <w:p>
       <w:r>
-        <w:t>Practical implications. For portrayed/elicited children's speech (e.g., clinical screening, educational applications), prosody-guided pooling is strongly recommended. For naturalistic/naturalistic speech, alternative attention mechanisms may be needed.</w:t>
-      </w:r>
-    </w:p>
-    <w:p>
-      <w:r>
-        <w:t>Limitations. (1) C-BESD is portrayed speech — generalizability to naturalistic children's speech remains to be validated. (2) The prosody features (F0, energy) are simple — richer features (voice quality, spectral tilt) may provide additional gains. (3) Cross-language FD was estimated due to data constraints. (4) All experiments use frozen SSL backbones; fine-tuning may yield further improvements.</w:t>
+        <w:t>Practical implications. For children's portrayed speech (e.g., clinical screening, educational assessment), prosody-guided pooling is an effective lightweight approach. For naturalistic conversation, improvements are needed.</w:t>
       </w:r>
     </w:p>
     <w:p>
@@ -2310,7 +2960,12 @@
     </w:p>
     <w:p>
       <w:r>
-        <w:t>We present the first comprehensive study combining SSL models with children's SER. Our prosody-guided temporal pooling achieves 80.85% on C-BESD, substantially outperforming published baselines. Cross-dataset experiments reveal that prosody pooling's effectiveness depends on both speaker age and recording style — a nuanced finding that challenges simple adult-to-child transfer assumptions. The unified FD-Accuracy framework provides a quantitative tool for understanding and predicting distribution-shift-induced degradation across three orthogonal dimensions. We hope this work draws attention to the underexplored area of children's SER and provides a foundation for future research.</w:t>
+        <w:t>We present the first systematic evaluation of frozen SSL representations for children's SER under rigorous speaker-independent conditions. Prosody-guided temporal pooling achieves 80.9% WA on C-BESD. Cross-dataset comparison reveals prosody pooling benefits vary with both speaker age and emotion elicitation method. The FD-Accuracy monotonic trend across three shift dimensions suggests FD as a potential distribution shift risk indicator. We hope this work draws attention to the underexplored area of children's SER.</w:t>
+      </w:r>
+    </w:p>
+    <w:p>
+      <w:r>
+        <w:t>Limitations: (1) C-BESD is portrayed speech; generalizability to naturalistic children's speech remains to be validated. (2) Cross-language results use historical protocol. (3) Some conclusions rely on limited data points. (4) IEMOCAP 6-class mapping is not fully comparable with standard 4-class benchmarks.</w:t>
       </w:r>
     </w:p>
     <w:p>
@@ -2331,27 +2986,37 @@
     </w:p>
     <w:p>
       <w:r>
-        <w:t>[1] Rao et al., "Children's Speech Emotion Recognition Using Feature Fusion-Based Deep Neural Networks," IEEE INSPECT, 2024.</w:t>
+        <w:t>[1] Chen, S., et al. "WavLM: Large-Scale Self-Supervised Pre-Training for Full Stack Speech Processing." IEEE SPL, 2022.</w:t>
       </w:r>
     </w:p>
     <w:p>
       <w:r>
-        <w:t>[2] Chen et al., "WavLM: Large-Scale Self-Supervised Pre-Training for Full Stack Speech Processing," IEEE SPL, 2022.</w:t>
+        <w:t>[2] Kakouros, S., et al. "Speech-Based Emotion Recognition with Self-Supervised Models Using Attentive Channel-Wise Correlations and Label Smoothing." arXiv:2211.01756, 2022.</w:t>
       </w:r>
     </w:p>
     <w:p>
       <w:r>
-        <w:t>[3] Fan et al., "Benchmarking Children's ASR with Supervised and Self-supervised Speech Foundation Models," INTERSPEECH, 2024.</w:t>
+        <w:t>[3] Phukan, O. C., et al. "A Comparative Study of Pre-trained Speech and Audio Embeddings for Speech Emotion Recognition." arXiv:2304.11472, 2023.</w:t>
       </w:r>
     </w:p>
     <w:p>
       <w:r>
-        <w:t>[4] Lesyk et al., "Empathetic Deep Learning: Transferring Adult Speech Emotion Models to Children," HCIS, 2024.</w:t>
+        <w:t>[4] Fan, R., et al. "Benchmarking Children's ASR with Supervised and Self-supervised Speech Foundation Models." INTERSPEECH, 2024.</w:t>
       </w:r>
     </w:p>
     <w:p>
       <w:r>
-        <w:t>[5] Dong et al., "Test-Time Adaptation for Speech Emotion Recognition," ICASSP, 2026.</w:t>
+        <w:t>[5] Rao, D. V., et al. "Children's Speech Emotion Recognition Using Feature Fusion-Based Deep Neural Networks." IEEE INSPECT, 2024.</w:t>
+      </w:r>
+    </w:p>
+    <w:p>
+      <w:r>
+        <w:t>[6] Lesyk, E., et al. "Empathetic Deep Learning: Transferring Adult Speech Emotion Models to Children With Gender-Specific Adaptations Using Neural Embeddings." HCIS, 2024.</w:t>
+      </w:r>
+    </w:p>
+    <w:p>
+      <w:r>
+        <w:t>[7] Dong, J., et al. "Test-Time Adaptation for Speech Emotion Recognition." ICASSP, 2026.</w:t>
       </w:r>
     </w:p>
     <w:sectPr>

</xml_diff>